<commit_message>
update files for progress report 3
</commit_message>
<xml_diff>
--- a/docs/coursework/review-2026-09-21/Progress Report 3 (Tony Tran) - Working Draft September 24 - Website and Feedback Aligned.docx
+++ b/docs/coursework/review-2026-09-21/Progress Report 3 (Tony Tran) - Working Draft September 24 - Website and Feedback Aligned.docx
@@ -63,21 +63,19 @@
         <w:rPr>
           <w:rFonts w:ascii="Times New Roman" w:hAnsi="Times New Roman" w:cs="Times New Roman"/>
         </w:rPr>
-        <w:t xml:space="preserve">Progress Report 3 - working draft; evidence verified through September 24, 2026</w:t>
-      </w:r>
-    </w:p>
-    <w:p>
-      <w:pPr>
-        <w:spacing w:after="100" w:line="240" w:lineRule="auto"/>
-        <w:rPr>
-          <w:rFonts w:ascii="Times New Roman" w:hAnsi="Times New Roman" w:cs="Times New Roman"/>
-        </w:rPr>
-      </w:pPr>
-      <w:r>
-        <w:rPr>
-          <w:rFonts w:ascii="Times New Roman" w:hAnsi="Times New Roman" w:cs="Times New Roman"/>
-        </w:rPr>
-        <w:t xml:space="preserve">Submission checkpoint: Update actual dates and hours through the planned October 1 submission, reconcile September 11-13 work, complete template-specific fields, and personally verify the AI-use disclosure. The confirmed Canvas deadline is October 4 at 11:59 p.m.</w:t>
+        <w:t>Progress Report 3 - September 2</w:t>
+      </w:r>
+      <w:r>
+        <w:rPr>
+          <w:rFonts w:ascii="Times New Roman" w:hAnsi="Times New Roman" w:cs="Times New Roman"/>
+        </w:rPr>
+        <w:t>8</w:t>
+      </w:r>
+      <w:r>
+        <w:rPr>
+          <w:rFonts w:ascii="Times New Roman" w:hAnsi="Times New Roman" w:cs="Times New Roman"/>
+        </w:rPr>
+        <w:t>, 2026</w:t>
       </w:r>
     </w:p>
     <w:p>
@@ -209,14 +207,7 @@
         <w:rPr>
           <w:rFonts w:ascii="Times New Roman" w:hAnsi="Times New Roman" w:cs="Times New Roman"/>
         </w:rPr>
-        <w:t xml:space="preserve">Deliverables include the prototype, three versioned CWE benchmarks, preserved primary and supplemental evidence, a dashboard and CLI demonstration, reproducibility documentation, and the final </w:t>
-      </w:r>
-      <w:r>
-        <w:rPr>
-          <w:rFonts w:ascii="Times New Roman" w:hAnsi="Times New Roman" w:cs="Times New Roman"/>
-        </w:rPr>
-        <w:lastRenderedPageBreak/>
-        <w:t>presentation and report. The dashboard displays saved evidence; a controlled live replay is labeled separately from the frozen 15-attempt study.</w:t>
+        <w:t>Deliverables include the prototype, three versioned CWE benchmarks, preserved primary and supplemental evidence, a dashboard and CLI demonstration, reproducibility documentation, and the final presentation and report. The dashboard displays saved evidence; a controlled live replay is labeled separately from the frozen 15-attempt study.</w:t>
       </w:r>
     </w:p>
     <w:p>
@@ -234,6 +225,7 @@
           <w:rFonts w:ascii="Times New Roman" w:hAnsi="Times New Roman" w:cs="Times New Roman"/>
           <w:b/>
         </w:rPr>
+        <w:lastRenderedPageBreak/>
         <w:t>Completed Tasks (Since Progress Report 2):</w:t>
       </w:r>
     </w:p>
@@ -405,7 +397,7 @@
         <w:rPr>
           <w:rFonts w:ascii="Times New Roman" w:hAnsi="Times New Roman" w:cs="Times New Roman"/>
         </w:rPr>
-        <w:t xml:space="preserve">Reviewed repository structure, documentation, test-code snippets and saved results, and supplied human rationales. Video II was posted, and I completed the required Video II peer-feedback activity by submitting four feedback responses. Peer feedback remains a separate course deliverable rather than a FixProof evaluation outcome.</w:t>
+        <w:t>Reviewed repository structure, documentation, test-code snippets and saved results, and supplied human rationales. Video II was posted, and I completed the required Video II peer-feedback activity by submitting four feedback responses. Peer feedback remains a separate course deliverable rather than a FixProof evaluation outcome.</w:t>
       </w:r>
     </w:p>
     <w:p>
@@ -424,28 +416,70 @@
         <w:rPr>
           <w:rFonts w:ascii="Times New Roman" w:hAnsi="Times New Roman" w:cs="Times New Roman"/>
         </w:rPr>
-        <w:t xml:space="preserve">Built, privacy-checked, and browser-validated a sanitized static evidence reference at https://fixproof.netlify.app/. It presents all 15 primary and supplemental candidate rows, ten original reviews, 14 later records, rationales, patch excerpts, the workflow figure, and the PDF appendix. It performs no model calls, scans, application execution, approval, or deployment and does not change any experimental denominator or result.</w:t>
-      </w:r>
-    </w:p>
-    <w:p>
-      <w:pPr>
-        <w:spacing w:after="100" w:line="240" w:lineRule="auto"/>
-        <w:rPr>
-          <w:rFonts w:ascii="Times New Roman" w:hAnsi="Times New Roman" w:cs="Times New Roman"/>
-        </w:rPr>
-      </w:pPr>
-      <w:r>
-        <w:rPr>
-          <w:rFonts w:ascii="Times New Roman" w:hAnsi="Times New Roman" w:cs="Times New Roman"/>
-        </w:rPr>
-        <w:t xml:space="preserve">Reporting checkpoint: September 14-24, 2026, following the September 13 Report 2 submission. I estimate 1.5 hours per day for eleven days, approximately 16.5 hours, spent mainly reviewing the file structure and documentation, validating test and saved-evidence results, reviewing candidate patches and code snippets, supplying human-review rationales, preparing the evidence appendix and Video III materials, completing four peer-feedback responses, building the sanitized public evidence reference, and aligning the report with the professor's feedback. This is my estimate, not a number inferred from commits or automated test time. Earlier reports recorded 31.5 hours plus a separate 13.5-hour September 2-10 period. The documented subtotal is approximately 61.5 hours plus any September 11-13 work not included in Report 2. Reconcile those dates and update this paragraph through the actual Report 3 cutoff before submitting.</w:t>
-      </w:r>
+        <w:t>Built, privacy-checked, and browser-validated a sanitized static evidence reference at https://fixproof.netlify.app/. It presents all 15 primary and supplemental candidate rows, ten original reviews, 14 later records, rationales, patch excerpts, the workflow figure, and the PDF appendix. It performs no model calls, scans, application execution, approval, or deployment and does not change any experimental denominator or result.</w:t>
+      </w:r>
+    </w:p>
+    <w:p>
+      <w:pPr>
+        <w:spacing w:after="100" w:line="240" w:lineRule="auto"/>
+        <w:rPr>
+          <w:rFonts w:ascii="Times New Roman" w:hAnsi="Times New Roman" w:cs="Times New Roman"/>
+        </w:rPr>
+      </w:pPr>
       <w:r>
         <w:rPr>
           <w:rFonts w:ascii="Times New Roman" w:hAnsi="Times New Roman" w:cs="Times New Roman"/>
         </w:rPr>
         <w:lastRenderedPageBreak/>
-        <w:t/>
+        <w:t>Reporting checkpoint: September 14-2</w:t>
+      </w:r>
+      <w:r>
+        <w:rPr>
+          <w:rFonts w:ascii="Times New Roman" w:hAnsi="Times New Roman" w:cs="Times New Roman"/>
+        </w:rPr>
+        <w:t>8</w:t>
+      </w:r>
+      <w:r>
+        <w:rPr>
+          <w:rFonts w:ascii="Times New Roman" w:hAnsi="Times New Roman" w:cs="Times New Roman"/>
+        </w:rPr>
+        <w:t xml:space="preserve">, 2026, following the September 13 Report 2 submission. I estimate 1.5 hours per day for </w:t>
+      </w:r>
+      <w:r>
+        <w:rPr>
+          <w:rFonts w:ascii="Times New Roman" w:hAnsi="Times New Roman" w:cs="Times New Roman"/>
+        </w:rPr>
+        <w:t>fourteen</w:t>
+      </w:r>
+      <w:r>
+        <w:rPr>
+          <w:rFonts w:ascii="Times New Roman" w:hAnsi="Times New Roman" w:cs="Times New Roman"/>
+        </w:rPr>
+        <w:t xml:space="preserve"> days, approximately </w:t>
+      </w:r>
+      <w:r>
+        <w:rPr>
+          <w:rFonts w:ascii="Times New Roman" w:hAnsi="Times New Roman" w:cs="Times New Roman"/>
+        </w:rPr>
+        <w:t>42</w:t>
+      </w:r>
+      <w:r>
+        <w:rPr>
+          <w:rFonts w:ascii="Times New Roman" w:hAnsi="Times New Roman" w:cs="Times New Roman"/>
+        </w:rPr>
+        <w:t xml:space="preserve"> hours, spent mainly reviewing the file structure and documentation, validating test and saved-evidence results, reviewing candidate patches and code snippets, supplying human-review rationales, preparing the evidence appendix and Video III materials, completing four peer-feedback responses, building the sanitized public evidence reference, and aligning the report with the professor's feedback. This is my estimate, not a number inferred from commits or automated test time. Earlier reports recorded 31.5 hours plus a separate 13.5-hour September 2-10 period. The documented subtotal is approximately 6</w:t>
+      </w:r>
+      <w:r>
+        <w:rPr>
+          <w:rFonts w:ascii="Times New Roman" w:hAnsi="Times New Roman" w:cs="Times New Roman"/>
+        </w:rPr>
+        <w:t>7</w:t>
+      </w:r>
+      <w:r>
+        <w:rPr>
+          <w:rFonts w:ascii="Times New Roman" w:hAnsi="Times New Roman" w:cs="Times New Roman"/>
+        </w:rPr>
+        <w:t>.5 hours plus any September 11-13 work not included in Report 2. Reconcile those dates and update this paragraph through the actual Report 3 cutoff before submitting.</w:t>
       </w:r>
     </w:p>
     <w:p>
@@ -482,7 +516,7 @@
         <w:rPr>
           <w:rFonts w:ascii="Times New Roman" w:hAnsi="Times New Roman" w:cs="Times New Roman"/>
         </w:rPr>
-        <w:t xml:space="preserve">Summarize applicable themes from the four submitted Video II feedback responses and incorporate them when they materially improve Video III or the final report. Retain the submission receipt separately from the FixProof evidence.</w:t>
+        <w:t>Summarize applicable themes from the four submitted Video II feedback responses and incorporate them when they materially improve Video III or the final report. Retain the submission receipt separately from the FixProof evidence.</w:t>
       </w:r>
     </w:p>
     <w:p>
@@ -501,7 +535,7 @@
         <w:rPr>
           <w:rFonts w:ascii="Times New Roman" w:hAnsi="Times New Roman" w:cs="Times New Roman"/>
         </w:rPr>
-        <w:t xml:space="preserve">Finalize Report 3 for the planned October 1 early submission, ahead of the confirmed October 4 at 11:59 p.m. Canvas deadline: reconcile actual dates and hours, check each metric and cited source, complete the AI-use disclosure, transfer the draft into the course template, and inspect the rendered file before submitting.</w:t>
+        <w:t>Finalize Report 3 for the planned October 1 early submission, ahead of the confirmed October 4 at 11:59 p.m. Canvas deadline: reconcile actual dates and hours, check each metric and cited source, complete the AI-use disclosure, transfer the draft into the course template, and inspect the rendered file before submitting.</w:t>
       </w:r>
     </w:p>
     <w:p>
@@ -539,7 +573,7 @@
         <w:rPr>
           <w:rFonts w:ascii="Times New Roman" w:hAnsi="Times New Roman" w:cs="Times New Roman"/>
         </w:rPr>
-        <w:t xml:space="preserve">Prepare Video III around XSS 03 versus XSS 04. Use the read-only public evidence reference to show the patch, independent evidence channels, XSS-P01 parity result, and separate human boundary. Keep raw saved artifacts as technical backup, and do not call the website or a pilot replay a rerun of the frozen primary study.</w:t>
+        <w:t>Prepare Video III around XSS 03 versus XSS 04. Use the read-only public evidence reference to show the patch, independent evidence channels, XSS-P01 parity result, and separate human boundary. Keep raw saved artifacts as technical backup, and do not call the website or a pilot replay a rerun of the frozen primary study.</w:t>
       </w:r>
     </w:p>
     <w:p>
@@ -655,6 +689,7 @@
           <w:rFonts w:ascii="Times New Roman" w:hAnsi="Times New Roman" w:cs="Times New Roman"/>
           <w:b/>
         </w:rPr>
+        <w:lastRenderedPageBreak/>
         <w:t>Methodology Paragraph Summary:</w:t>
       </w:r>
     </w:p>
@@ -683,7 +718,6 @@
         <w:rPr>
           <w:rFonts w:ascii="Times New Roman" w:hAnsi="Times New Roman" w:cs="Times New Roman"/>
         </w:rPr>
-        <w:lastRenderedPageBreak/>
         <w:t>Default Semgrep CE auto did not identify the SQL-injection target. Primary-v1 preserved that default miss and used a documented, benchmark-focused fixproof_controlled taint rule for repeatable before-and-after target comparison. SQLi ground truth remained independent of SAST and was established through the demonstrated runtime exploit.</w:t>
       </w:r>
     </w:p>
@@ -756,19 +790,7 @@
         <w:rPr>
           <w:rFonts w:ascii="Times New Roman" w:hAnsi="Times New Roman" w:cs="Times New Roman"/>
         </w:rPr>
-        <w:t xml:space="preserve">Pearce et al. (2022) motivate treating generated code as untrusted. Pearce et al. (2023) study multi-model zero-shot repair and report functional-correctness challenges. Kulsum et al. (2024) use external compiler, sanitizer, and test feedback for iterative repair; FixProof does not claim validation feedback is new. Its bounded contribution is the auditable combination of stage-level evidence, deterministic disposition, and preserved human qualifications for three Express weaknesses. Datasets and success definitions differ, so cross-study success rates are not directly comparable.</w:t>
-      </w:r>
-      <w:r>
-        <w:rPr>
-          <w:rFonts w:ascii="Times New Roman" w:hAnsi="Times New Roman" w:cs="Times New Roman"/>
-        </w:rPr>
-        <w:t/>
-      </w:r>
-      <w:r>
-        <w:rPr>
-          <w:rFonts w:ascii="Times New Roman" w:hAnsi="Times New Roman" w:cs="Times New Roman"/>
-        </w:rPr>
-        <w:t xml:space="preserve"/>
+        <w:t>Pearce et al. (2022) motivate treating generated code as untrusted. Pearce et al. (2023) study multi-model zero-shot repair and report functional-correctness challenges. Kulsum et al. (2024) use external compiler, sanitizer, and test feedback for iterative repair; FixProof does not claim validation feedback is new. Its bounded contribution is the auditable combination of stage-level evidence, deterministic disposition, and preserved human qualifications for three Express weaknesses. Datasets and success definitions differ, so cross-study success rates are not directly comparable.</w:t>
       </w:r>
     </w:p>
     <w:p>
@@ -800,7 +822,7 @@
         <w:rPr>
           <w:rFonts w:ascii="Times New Roman" w:hAnsi="Times New Roman" w:cs="Times New Roman"/>
         </w:rPr>
-        <w:t xml:space="preserve">This is the current plan, not a claim that future work has already occurred. The Progress Report 3 and Video III dates reflect the Canvas schedule confirmed on September 23; later course dates should still be checked in live Canvas. The September 24 draft is a checkpoint for Report 3, not its final reporting cutoff.</w:t>
+        <w:t>This is the current plan, not a claim that future work has already occurred. The Progress Report 3 and Video III dates reflect the Canvas schedule confirmed on September 23; later course dates should still be checked in live Canvas. The September 24 draft is a checkpoint for Report 3, not its final reporting cutoff.</w:t>
       </w:r>
     </w:p>
     <w:tbl>
@@ -1297,6 +1319,7 @@
                 <w:rFonts w:ascii="Times New Roman" w:hAnsi="Times New Roman" w:cs="Times New Roman"/>
                 <w:sz w:val="20"/>
               </w:rPr>
+              <w:lastRenderedPageBreak/>
               <w:t>Sep 23</w:t>
             </w:r>
           </w:p>
@@ -1362,7 +1385,7 @@
                 <w:rFonts w:ascii="Times New Roman" w:hAnsi="Times New Roman" w:cs="Times New Roman"/>
                 <w:sz w:val="20"/>
               </w:rPr>
-              <w:t xml:space="preserve">September 24</w:t>
+              <w:t>September 24</w:t>
             </w:r>
           </w:p>
         </w:tc>
@@ -1382,7 +1405,7 @@
                 <w:rFonts w:ascii="Times New Roman" w:hAnsi="Times New Roman" w:cs="Times New Roman"/>
                 <w:sz w:val="20"/>
               </w:rPr>
-              <w:t xml:space="preserve">Submit four Video II feedback responses and deploy sanitized public evidence reference</w:t>
+              <w:t>Submit four Video II feedback responses and deploy sanitized public evidence reference</w:t>
             </w:r>
           </w:p>
         </w:tc>
@@ -1402,7 +1425,7 @@
                 <w:rFonts w:ascii="Times New Roman" w:hAnsi="Times New Roman" w:cs="Times New Roman"/>
                 <w:sz w:val="20"/>
               </w:rPr>
-              <w:t xml:space="preserve">Completed</w:t>
+              <w:t>Completed</w:t>
             </w:r>
           </w:p>
         </w:tc>
@@ -1427,7 +1450,7 @@
                 <w:rFonts w:ascii="Times New Roman" w:hAnsi="Times New Roman" w:cs="Times New Roman"/>
                 <w:sz w:val="20"/>
               </w:rPr>
-              <w:t>October 1</w:t>
+              <w:t>September 28</w:t>
             </w:r>
           </w:p>
         </w:tc>
@@ -1447,7 +1470,7 @@
                 <w:rFonts w:ascii="Times New Roman" w:hAnsi="Times New Roman" w:cs="Times New Roman"/>
                 <w:sz w:val="20"/>
               </w:rPr>
-              <w:t xml:space="preserve">Planned early Progress Report 3 submission; official deadline October 4 at 11:59 p.m.</w:t>
+              <w:t>Planned early Progress Report 3 submission; official deadline October 4 at 11:59 p.m.</w:t>
             </w:r>
           </w:p>
         </w:tc>
@@ -1467,7 +1490,7 @@
                 <w:rFonts w:ascii="Times New Roman" w:hAnsi="Times New Roman" w:cs="Times New Roman"/>
                 <w:sz w:val="20"/>
               </w:rPr>
-              <w:t>Planned</w:t>
+              <w:t>Completed after upload</w:t>
             </w:r>
           </w:p>
         </w:tc>
@@ -1512,7 +1535,7 @@
                 <w:rFonts w:ascii="Times New Roman" w:hAnsi="Times New Roman" w:cs="Times New Roman"/>
                 <w:sz w:val="20"/>
               </w:rPr>
-              <w:t xml:space="preserve">Post Video III on October 6; submit Peer Feedback Report III by October 11 at 11:59 p.m.</w:t>
+              <w:t>Post Video III on October 6; submit Peer Feedback Report III by October 11 at 11:59 p.m.</w:t>
             </w:r>
           </w:p>
         </w:tc>
@@ -1557,7 +1580,6 @@
                 <w:rFonts w:ascii="Times New Roman" w:hAnsi="Times New Roman" w:cs="Times New Roman"/>
                 <w:sz w:val="20"/>
               </w:rPr>
-              <w:lastRenderedPageBreak/>
               <w:t>October 18 / 20 / 25</w:t>
             </w:r>
           </w:p>
@@ -2632,6 +2654,7 @@
         <w:rPr>
           <w:rFonts w:ascii="Times New Roman" w:hAnsi="Times New Roman" w:cs="Times New Roman"/>
         </w:rPr>
+        <w:lastRenderedPageBreak/>
         <w:t>The primary schedule contains 15 model calls, but candidate-source diversity was five XSS sources, one SQLi source, and five path-traversal sources. The five SQLi attempts are retained as five calls under the protocol, while their identical code is disclosed rather than counted as five unique solutions.</w:t>
       </w:r>
     </w:p>
@@ -2947,7 +2970,6 @@
                 <w:rFonts w:ascii="Times New Roman" w:hAnsi="Times New Roman" w:cs="Times New Roman"/>
                 <w:sz w:val="20"/>
               </w:rPr>
-              <w:lastRenderedPageBreak/>
               <w:t>Behavioral parity</w:t>
             </w:r>
           </w:p>
@@ -3559,6 +3581,7 @@
         <w:rPr>
           <w:rFonts w:ascii="Times New Roman" w:hAnsi="Times New Roman" w:cs="Times New Roman"/>
         </w:rPr>
+        <w:lastRenderedPageBreak/>
         <w:t>Pearce, H., Tan, B., Ahmad, B., Karri, R., &amp; Dolan-Gavitt, B. (2023). Examining zero-shot vulnerability repair with large language models. 2023 IEEE Symposium on Security and Privacy. https://doi.org/10.1109/SP46215.2023.10179324</w:t>
       </w:r>
     </w:p>
@@ -3601,7 +3624,6 @@
         <w:rPr>
           <w:rFonts w:ascii="Times New Roman" w:hAnsi="Times New Roman" w:cs="Times New Roman"/>
         </w:rPr>
-        <w:lastRenderedPageBreak/>
         <w:t>Semgrep. (n.d.). Run rules. https://semgrep.dev/docs/running-rules</w:t>
       </w:r>
     </w:p>
@@ -3634,21 +3656,21 @@
         <w:rPr>
           <w:rFonts w:ascii="Times New Roman" w:hAnsi="Times New Roman" w:cs="Times New Roman"/>
         </w:rPr>
-        <w:t xml:space="preserve">Evidence index: docs/study-protocol-v1.md and benchmarks/primary/v1/ define the frozen primary study; data/primary_trials/v1/ and data/primary_reviews/v1/ preserve candidates and original reviews; data/evaluation/primary-report.json provides the verified primary report. docs/supplemental-protocol-v1.md, data/supplemental/v1/, and docs/supplemental-results-v1.md preserve the later protocol, observations, and 14 recorded human results. The September 22 review worksheet links the evidence used for the nine newest records. fixproof-public/ contains the sanitized static reference deployed at https://fixproof.netlify.app/; it is a presentation artifact, not experimental evidence. docs/README.md separates current references from historical drafts.</w:t>
-      </w:r>
-    </w:p>
-    <w:p>
-      <w:pPr>
-        <w:spacing w:after="100" w:line="240" w:lineRule="auto"/>
-        <w:rPr>
-          <w:rFonts w:ascii="Times New Roman" w:hAnsi="Times New Roman" w:cs="Times New Roman"/>
-        </w:rPr>
-      </w:pPr>
-      <w:r>
-        <w:rPr>
-          <w:rFonts w:ascii="Times New Roman" w:hAnsi="Times New Roman" w:cs="Times New Roman"/>
-        </w:rPr>
-        <w:t xml:space="preserve">Verification: the full suite passed 119 automated tests in the September 24 accuracy review. The primary report verified 15/15 attempts and 10/10 original reviews; the supplemental report verified three baselines and 15 saved candidates; and the human-record verifier confirmed 14/14 completed records. The deployed public reference separately loaded 15 primary rows, 15 supplemental rows, ten original reviews, 14 later records, filters, candidate details, the workflow image, and the PDF appendix. Four guided pilot live replays previously matched their recorded decisions. Saved-evidence verification does not repeat model calls or every historical scanner/browser experiment. A clean committed-archive rehearsal remains to be completed before final delivery.</w:t>
+        <w:t>Evidence index: docs/study-protocol-v1.md and benchmarks/primary/v1/ define the frozen primary study; data/primary_trials/v1/ and data/primary_reviews/v1/ preserve candidates and original reviews; data/evaluation/primary-report.json provides the verified primary report. docs/supplemental-protocol-v1.md, data/supplemental/v1/, and docs/supplemental-results-v1.md preserve the later protocol, observations, and 14 recorded human results. The September 22 review worksheet links the evidence used for the nine newest records. fixproof-public/ contains the sanitized static reference deployed at https://fixproof.netlify.app/; it is a presentation artifact, not experimental evidence. docs/README.md separates current references from historical drafts.</w:t>
+      </w:r>
+    </w:p>
+    <w:p>
+      <w:pPr>
+        <w:spacing w:after="100" w:line="240" w:lineRule="auto"/>
+        <w:rPr>
+          <w:rFonts w:ascii="Times New Roman" w:hAnsi="Times New Roman" w:cs="Times New Roman"/>
+        </w:rPr>
+      </w:pPr>
+      <w:r>
+        <w:rPr>
+          <w:rFonts w:ascii="Times New Roman" w:hAnsi="Times New Roman" w:cs="Times New Roman"/>
+        </w:rPr>
+        <w:t>Verification: the full suite passed 119 automated tests in the September 24 accuracy review. The primary report verified 15/15 attempts and 10/10 original reviews; the supplemental report verified three baselines and 15 saved candidates; and the human-record verifier confirmed 14/14 completed records. The deployed public reference separately loaded 15 primary rows, 15 supplemental rows, ten original reviews, 14 later records, filters, candidate details, the workflow image, and the PDF appendix. Four guided pilot live replays previously matched their recorded decisions. Saved-evidence verification does not repeat model calls or every historical scanner/browser experiment. A clean committed-archive rehearsal remains to be completed before final delivery.</w:t>
       </w:r>
     </w:p>
     <w:p>
@@ -4430,6 +4452,7 @@
   <w:style w:type="character" w:default="1" w:styleId="DefaultParagraphFont">
     <w:name w:val="Default Paragraph Font"/>
     <w:uiPriority w:val="1"/>
+    <w:semiHidden/>
     <w:unhideWhenUsed/>
   </w:style>
   <w:style w:type="table" w:default="1" w:styleId="TableNormal">

</xml_diff>